<commit_message>
Complete four-question modeling paper and analyses
</commit_message>
<xml_diff>
--- a/outputs/数学建模F题统一论文.docx
+++ b/outputs/数学建模F题统一论文.docx
@@ -2178,14 +2178,16 @@
         </w:tblBorders>
       </w:tblPr>
       <w:tblGrid>
-        <w:gridCol w:w="3360"/>
-        <w:gridCol w:w="3360"/>
-        <w:gridCol w:w="3360"/>
+        <w:gridCol w:w="2016"/>
+        <w:gridCol w:w="2016"/>
+        <w:gridCol w:w="2016"/>
+        <w:gridCol w:w="2016"/>
+        <w:gridCol w:w="2016"/>
       </w:tblGrid>
       <w:tr>
         <w:tc>
           <w:tcPr>
-            <w:tcW w:type="dxa" w:w="3360"/>
+            <w:tcW w:type="dxa" w:w="2016"/>
             <w:shd w:fill="1F4E78"/>
             <w:vAlign w:val="center"/>
           </w:tcPr>
@@ -2202,7 +2204,7 @@
         </w:tc>
         <w:tc>
           <w:tcPr>
-            <w:tcW w:type="dxa" w:w="3360"/>
+            <w:tcW w:type="dxa" w:w="2016"/>
             <w:shd w:fill="1F4E78"/>
             <w:vAlign w:val="center"/>
           </w:tcPr>
@@ -2219,7 +2221,7 @@
         </w:tc>
         <w:tc>
           <w:tcPr>
-            <w:tcW w:type="dxa" w:w="3360"/>
+            <w:tcW w:type="dxa" w:w="2016"/>
             <w:shd w:fill="1F4E78"/>
             <w:vAlign w:val="center"/>
           </w:tcPr>
@@ -2234,11 +2236,45 @@
             </w:r>
           </w:p>
         </w:tc>
+        <w:tc>
+          <w:tcPr>
+            <w:tcW w:type="dxa" w:w="2016"/>
+            <w:shd w:fill="1F4E78"/>
+            <w:vAlign w:val="center"/>
+          </w:tcPr>
+          <w:p>
+            <w:r>
+              <w:rPr>
+                <w:b/>
+                <w:color w:val="FFFFFF"/>
+                <w:sz w:val="14"/>
+              </w:rPr>
+              <w:t>ci_low</w:t>
+            </w:r>
+          </w:p>
+        </w:tc>
+        <w:tc>
+          <w:tcPr>
+            <w:tcW w:type="dxa" w:w="2016"/>
+            <w:shd w:fill="1F4E78"/>
+            <w:vAlign w:val="center"/>
+          </w:tcPr>
+          <w:p>
+            <w:r>
+              <w:rPr>
+                <w:b/>
+                <w:color w:val="FFFFFF"/>
+                <w:sz w:val="14"/>
+              </w:rPr>
+              <w:t>ci_high</w:t>
+            </w:r>
+          </w:p>
+        </w:tc>
       </w:tr>
       <w:tr>
         <w:tc>
           <w:tcPr>
-            <w:tcW w:type="dxa" w:w="3360"/>
+            <w:tcW w:type="dxa" w:w="2016"/>
             <w:vAlign w:val="center"/>
             <w:shd w:fill="F3F6F9"/>
           </w:tcPr>
@@ -2253,7 +2289,7 @@
         </w:tc>
         <w:tc>
           <w:tcPr>
-            <w:tcW w:type="dxa" w:w="3360"/>
+            <w:tcW w:type="dxa" w:w="2016"/>
             <w:vAlign w:val="center"/>
             <w:shd w:fill="F3F6F9"/>
           </w:tcPr>
@@ -2268,7 +2304,7 @@
         </w:tc>
         <w:tc>
           <w:tcPr>
-            <w:tcW w:type="dxa" w:w="3360"/>
+            <w:tcW w:type="dxa" w:w="2016"/>
             <w:vAlign w:val="center"/>
             <w:shd w:fill="F3F6F9"/>
           </w:tcPr>
@@ -2278,6 +2314,36 @@
                 <w:sz w:val="14"/>
               </w:rPr>
               <w:t>stage2_beta_relaxed</w:t>
+            </w:r>
+          </w:p>
+        </w:tc>
+        <w:tc>
+          <w:tcPr>
+            <w:tcW w:type="dxa" w:w="2016"/>
+            <w:vAlign w:val="center"/>
+            <w:shd w:fill="F3F6F9"/>
+          </w:tcPr>
+          <w:p>
+            <w:r>
+              <w:rPr>
+                <w:sz w:val="14"/>
+              </w:rPr>
+              <w:t>2.0545</w:t>
+            </w:r>
+          </w:p>
+        </w:tc>
+        <w:tc>
+          <w:tcPr>
+            <w:tcW w:type="dxa" w:w="2016"/>
+            <w:vAlign w:val="center"/>
+            <w:shd w:fill="F3F6F9"/>
+          </w:tcPr>
+          <w:p>
+            <w:r>
+              <w:rPr>
+                <w:sz w:val="14"/>
+              </w:rPr>
+              <w:t>2.0983</w:t>
             </w:r>
           </w:p>
         </w:tc>
@@ -2285,7 +2351,7 @@
       <w:tr>
         <w:tc>
           <w:tcPr>
-            <w:tcW w:type="dxa" w:w="3360"/>
+            <w:tcW w:type="dxa" w:w="2016"/>
             <w:vAlign w:val="center"/>
           </w:tcPr>
           <w:p>
@@ -2299,7 +2365,7 @@
         </w:tc>
         <w:tc>
           <w:tcPr>
-            <w:tcW w:type="dxa" w:w="3360"/>
+            <w:tcW w:type="dxa" w:w="2016"/>
             <w:vAlign w:val="center"/>
           </w:tcPr>
           <w:p>
@@ -2313,7 +2379,7 @@
         </w:tc>
         <w:tc>
           <w:tcPr>
-            <w:tcW w:type="dxa" w:w="3360"/>
+            <w:tcW w:type="dxa" w:w="2016"/>
             <w:vAlign w:val="center"/>
           </w:tcPr>
           <w:p>
@@ -2322,6 +2388,34 @@
                 <w:sz w:val="14"/>
               </w:rPr>
               <w:t>stage2_beta_relaxed</w:t>
+            </w:r>
+          </w:p>
+        </w:tc>
+        <w:tc>
+          <w:tcPr>
+            <w:tcW w:type="dxa" w:w="2016"/>
+            <w:vAlign w:val="center"/>
+          </w:tcPr>
+          <w:p>
+            <w:r>
+              <w:rPr>
+                <w:sz w:val="14"/>
+              </w:rPr>
+              <w:t>1.2317</w:t>
+            </w:r>
+          </w:p>
+        </w:tc>
+        <w:tc>
+          <w:tcPr>
+            <w:tcW w:type="dxa" w:w="2016"/>
+            <w:vAlign w:val="center"/>
+          </w:tcPr>
+          <w:p>
+            <w:r>
+              <w:rPr>
+                <w:sz w:val="14"/>
+              </w:rPr>
+              <w:t>1.2876</w:t>
             </w:r>
           </w:p>
         </w:tc>
@@ -2329,7 +2423,7 @@
       <w:tr>
         <w:tc>
           <w:tcPr>
-            <w:tcW w:type="dxa" w:w="3360"/>
+            <w:tcW w:type="dxa" w:w="2016"/>
             <w:vAlign w:val="center"/>
             <w:shd w:fill="F3F6F9"/>
           </w:tcPr>
@@ -2344,7 +2438,7 @@
         </w:tc>
         <w:tc>
           <w:tcPr>
-            <w:tcW w:type="dxa" w:w="3360"/>
+            <w:tcW w:type="dxa" w:w="2016"/>
             <w:vAlign w:val="center"/>
             <w:shd w:fill="F3F6F9"/>
           </w:tcPr>
@@ -2359,7 +2453,7 @@
         </w:tc>
         <w:tc>
           <w:tcPr>
-            <w:tcW w:type="dxa" w:w="3360"/>
+            <w:tcW w:type="dxa" w:w="2016"/>
             <w:vAlign w:val="center"/>
             <w:shd w:fill="F3F6F9"/>
           </w:tcPr>
@@ -2369,6 +2463,36 @@
                 <w:sz w:val="14"/>
               </w:rPr>
               <w:t>stage2_beta_relaxed</w:t>
+            </w:r>
+          </w:p>
+        </w:tc>
+        <w:tc>
+          <w:tcPr>
+            <w:tcW w:type="dxa" w:w="2016"/>
+            <w:vAlign w:val="center"/>
+            <w:shd w:fill="F3F6F9"/>
+          </w:tcPr>
+          <w:p>
+            <w:r>
+              <w:rPr>
+                <w:sz w:val="14"/>
+              </w:rPr>
+              <w:t>0.0650</w:t>
+            </w:r>
+          </w:p>
+        </w:tc>
+        <w:tc>
+          <w:tcPr>
+            <w:tcW w:type="dxa" w:w="2016"/>
+            <w:vAlign w:val="center"/>
+            <w:shd w:fill="F3F6F9"/>
+          </w:tcPr>
+          <w:p>
+            <w:r>
+              <w:rPr>
+                <w:sz w:val="14"/>
+              </w:rPr>
+              <w:t>0.0673</w:t>
             </w:r>
           </w:p>
         </w:tc>
@@ -2376,7 +2500,7 @@
       <w:tr>
         <w:tc>
           <w:tcPr>
-            <w:tcW w:type="dxa" w:w="3360"/>
+            <w:tcW w:type="dxa" w:w="2016"/>
             <w:vAlign w:val="center"/>
           </w:tcPr>
           <w:p>
@@ -2390,7 +2514,7 @@
         </w:tc>
         <w:tc>
           <w:tcPr>
-            <w:tcW w:type="dxa" w:w="3360"/>
+            <w:tcW w:type="dxa" w:w="2016"/>
             <w:vAlign w:val="center"/>
           </w:tcPr>
           <w:p>
@@ -2404,7 +2528,7 @@
         </w:tc>
         <w:tc>
           <w:tcPr>
-            <w:tcW w:type="dxa" w:w="3360"/>
+            <w:tcW w:type="dxa" w:w="2016"/>
             <w:vAlign w:val="center"/>
           </w:tcPr>
           <w:p>
@@ -2413,6 +2537,34 @@
                 <w:sz w:val="14"/>
               </w:rPr>
               <w:t>stage2_beta_relaxed</w:t>
+            </w:r>
+          </w:p>
+        </w:tc>
+        <w:tc>
+          <w:tcPr>
+            <w:tcW w:type="dxa" w:w="2016"/>
+            <w:vAlign w:val="center"/>
+          </w:tcPr>
+          <w:p>
+            <w:r>
+              <w:rPr>
+                <w:sz w:val="14"/>
+              </w:rPr>
+              <w:t>0.2648</w:t>
+            </w:r>
+          </w:p>
+        </w:tc>
+        <w:tc>
+          <w:tcPr>
+            <w:tcW w:type="dxa" w:w="2016"/>
+            <w:vAlign w:val="center"/>
+          </w:tcPr>
+          <w:p>
+            <w:r>
+              <w:rPr>
+                <w:sz w:val="14"/>
+              </w:rPr>
+              <w:t>0.2827</w:t>
             </w:r>
           </w:p>
         </w:tc>
@@ -2420,7 +2572,7 @@
       <w:tr>
         <w:tc>
           <w:tcPr>
-            <w:tcW w:type="dxa" w:w="3360"/>
+            <w:tcW w:type="dxa" w:w="2016"/>
             <w:vAlign w:val="center"/>
             <w:shd w:fill="F3F6F9"/>
           </w:tcPr>
@@ -2435,7 +2587,7 @@
         </w:tc>
         <w:tc>
           <w:tcPr>
-            <w:tcW w:type="dxa" w:w="3360"/>
+            <w:tcW w:type="dxa" w:w="2016"/>
             <w:vAlign w:val="center"/>
             <w:shd w:fill="F3F6F9"/>
           </w:tcPr>
@@ -2450,7 +2602,7 @@
         </w:tc>
         <w:tc>
           <w:tcPr>
-            <w:tcW w:type="dxa" w:w="3360"/>
+            <w:tcW w:type="dxa" w:w="2016"/>
             <w:vAlign w:val="center"/>
             <w:shd w:fill="F3F6F9"/>
           </w:tcPr>
@@ -2460,6 +2612,34 @@
                 <w:sz w:val="14"/>
               </w:rPr>
               <w:t>stage1_fixed_and_stage2_penalty</w:t>
+            </w:r>
+          </w:p>
+        </w:tc>
+        <w:tc>
+          <w:tcPr>
+            <w:tcW w:type="dxa" w:w="2016"/>
+            <w:vAlign w:val="center"/>
+            <w:shd w:fill="F3F6F9"/>
+          </w:tcPr>
+          <w:p>
+            <w:r>
+              <w:rPr>
+                <w:sz w:val="14"/>
+              </w:rPr>
+            </w:r>
+          </w:p>
+        </w:tc>
+        <w:tc>
+          <w:tcPr>
+            <w:tcW w:type="dxa" w:w="2016"/>
+            <w:vAlign w:val="center"/>
+            <w:shd w:fill="F3F6F9"/>
+          </w:tcPr>
+          <w:p>
+            <w:r>
+              <w:rPr>
+                <w:sz w:val="14"/>
+              </w:rPr>
             </w:r>
           </w:p>
         </w:tc>
@@ -2467,7 +2647,7 @@
       <w:tr>
         <w:tc>
           <w:tcPr>
-            <w:tcW w:type="dxa" w:w="3360"/>
+            <w:tcW w:type="dxa" w:w="2016"/>
             <w:vAlign w:val="center"/>
           </w:tcPr>
           <w:p>
@@ -2481,7 +2661,7 @@
         </w:tc>
         <w:tc>
           <w:tcPr>
-            <w:tcW w:type="dxa" w:w="3360"/>
+            <w:tcW w:type="dxa" w:w="2016"/>
             <w:vAlign w:val="center"/>
           </w:tcPr>
           <w:p>
@@ -2495,7 +2675,7 @@
         </w:tc>
         <w:tc>
           <w:tcPr>
-            <w:tcW w:type="dxa" w:w="3360"/>
+            <w:tcW w:type="dxa" w:w="2016"/>
             <w:vAlign w:val="center"/>
           </w:tcPr>
           <w:p>
@@ -2504,6 +2684,32 @@
                 <w:sz w:val="14"/>
               </w:rPr>
               <w:t>stage2_penalty</w:t>
+            </w:r>
+          </w:p>
+        </w:tc>
+        <w:tc>
+          <w:tcPr>
+            <w:tcW w:type="dxa" w:w="2016"/>
+            <w:vAlign w:val="center"/>
+          </w:tcPr>
+          <w:p>
+            <w:r>
+              <w:rPr>
+                <w:sz w:val="14"/>
+              </w:rPr>
+            </w:r>
+          </w:p>
+        </w:tc>
+        <w:tc>
+          <w:tcPr>
+            <w:tcW w:type="dxa" w:w="2016"/>
+            <w:vAlign w:val="center"/>
+          </w:tcPr>
+          <w:p>
+            <w:r>
+              <w:rPr>
+                <w:sz w:val="14"/>
+              </w:rPr>
             </w:r>
           </w:p>
         </w:tc>

</xml_diff>